<commit_message>
Atualiação do MER com legenda
</commit_message>
<xml_diff>
--- a/Projeto/banco de dados/Modelagem Relacional/MER TCC (com legenda).docx
+++ b/Projeto/banco de dados/Modelagem Relacional/MER TCC (com legenda).docx
@@ -2,6 +2,7 @@
 <file path=word/document.xml><?xml version="1.0" encoding="utf-8"?>
 <w:document xmlns:wpc="http://schemas.microsoft.com/office/word/2010/wordprocessingCanvas" xmlns:cx="http://schemas.microsoft.com/office/drawing/2014/chartex" xmlns:mc="http://schemas.openxmlformats.org/markup-compatibility/2006" xmlns:o="urn:schemas-microsoft-com:office:office" xmlns:r="http://schemas.openxmlformats.org/officeDocument/2006/relationships" xmlns:m="http://schemas.openxmlformats.org/officeDocument/2006/math" xmlns:v="urn:schemas-microsoft-com:vml" xmlns:wp14="http://schemas.microsoft.com/office/word/2010/wordprocessingDrawing" xmlns:wp="http://schemas.openxmlformats.org/drawingml/2006/wordprocessingDrawing" xmlns:w10="urn:schemas-microsoft-com:office:word" xmlns:w="http://schemas.openxmlformats.org/wordprocessingml/2006/main" xmlns:w14="http://schemas.microsoft.com/office/word/2010/wordml" xmlns:w15="http://schemas.microsoft.com/office/word/2012/wordml" xmlns:w16se="http://schemas.microsoft.com/office/word/2015/wordml/symex" xmlns:wpg="http://schemas.microsoft.com/office/word/2010/wordprocessingGroup" xmlns:wpi="http://schemas.microsoft.com/office/word/2010/wordprocessingInk" xmlns:wne="http://schemas.microsoft.com/office/word/2006/wordml" xmlns:wps="http://schemas.microsoft.com/office/word/2010/wordprocessingShape" mc:Ignorable="w14 w15 w16se wp14">
   <w:body>
+    <w:bookmarkStart w:id="0" w:name="_GoBack"/>
     <w:p>
       <w:r>
         <w:rPr>
@@ -386,7 +387,6 @@
           </wp:inline>
         </w:drawing>
       </w:r>
-      <w:bookmarkStart w:id="0" w:name="_GoBack"/>
       <w:bookmarkEnd w:id="0"/>
     </w:p>
     <w:sectPr>
@@ -1634,7 +1634,7 @@
 </file>
 
 <file path=customXml/itemProps1.xml><?xml version="1.0" encoding="utf-8"?>
-<ds:datastoreItem xmlns:ds="http://schemas.openxmlformats.org/officeDocument/2006/customXml" ds:itemID="{0EFB7752-C28B-4D3E-ADA5-F79F974EB83C}">
+<ds:datastoreItem xmlns:ds="http://schemas.openxmlformats.org/officeDocument/2006/customXml" ds:itemID="{BA7E5B08-72B7-4D0E-8AC4-A3EA798DE21E}">
   <ds:schemaRefs>
     <ds:schemaRef ds:uri="http://schemas.openxmlformats.org/officeDocument/2006/bibliography"/>
   </ds:schemaRefs>

</xml_diff>

<commit_message>
Atualização do MER (cpfs duplicados e remoção de um campo ineficiente na tabela epi)
</commit_message>
<xml_diff>
--- a/Projeto/banco de dados/Modelagem Relacional/MER TCC (com legenda).docx
+++ b/Projeto/banco de dados/Modelagem Relacional/MER TCC (com legenda).docx
@@ -1,8 +1,7 @@
 
 <file path=word/document.xml><?xml version="1.0" encoding="utf-8"?>
-<w:document xmlns:wpc="http://schemas.microsoft.com/office/word/2010/wordprocessingCanvas" xmlns:cx="http://schemas.microsoft.com/office/drawing/2014/chartex" xmlns:mc="http://schemas.openxmlformats.org/markup-compatibility/2006" xmlns:o="urn:schemas-microsoft-com:office:office" xmlns:r="http://schemas.openxmlformats.org/officeDocument/2006/relationships" xmlns:m="http://schemas.openxmlformats.org/officeDocument/2006/math" xmlns:v="urn:schemas-microsoft-com:vml" xmlns:wp14="http://schemas.microsoft.com/office/word/2010/wordprocessingDrawing" xmlns:wp="http://schemas.openxmlformats.org/drawingml/2006/wordprocessingDrawing" xmlns:w10="urn:schemas-microsoft-com:office:word" xmlns:w="http://schemas.openxmlformats.org/wordprocessingml/2006/main" xmlns:w14="http://schemas.microsoft.com/office/word/2010/wordml" xmlns:w15="http://schemas.microsoft.com/office/word/2012/wordml" xmlns:w16se="http://schemas.microsoft.com/office/word/2015/wordml/symex" xmlns:wpg="http://schemas.microsoft.com/office/word/2010/wordprocessingGroup" xmlns:wpi="http://schemas.microsoft.com/office/word/2010/wordprocessingInk" xmlns:wne="http://schemas.microsoft.com/office/word/2006/wordml" xmlns:wps="http://schemas.microsoft.com/office/word/2010/wordprocessingShape" mc:Ignorable="w14 w15 w16se wp14">
+<w:document xmlns:wpc="http://schemas.microsoft.com/office/word/2010/wordprocessingCanvas" xmlns:cx="http://schemas.microsoft.com/office/drawing/2014/chartex" xmlns:cx1="http://schemas.microsoft.com/office/drawing/2015/9/8/chartex" xmlns:cx2="http://schemas.microsoft.com/office/drawing/2015/10/21/chartex" xmlns:cx3="http://schemas.microsoft.com/office/drawing/2016/5/9/chartex" xmlns:cx4="http://schemas.microsoft.com/office/drawing/2016/5/10/chartex" xmlns:cx5="http://schemas.microsoft.com/office/drawing/2016/5/11/chartex" xmlns:cx6="http://schemas.microsoft.com/office/drawing/2016/5/12/chartex" xmlns:cx7="http://schemas.microsoft.com/office/drawing/2016/5/13/chartex" xmlns:cx8="http://schemas.microsoft.com/office/drawing/2016/5/14/chartex" xmlns:mc="http://schemas.openxmlformats.org/markup-compatibility/2006" xmlns:aink="http://schemas.microsoft.com/office/drawing/2016/ink" xmlns:am3d="http://schemas.microsoft.com/office/drawing/2017/model3d" xmlns:o="urn:schemas-microsoft-com:office:office" xmlns:oel="http://schemas.microsoft.com/office/2019/extlst" xmlns:r="http://schemas.openxmlformats.org/officeDocument/2006/relationships" xmlns:m="http://schemas.openxmlformats.org/officeDocument/2006/math" xmlns:v="urn:schemas-microsoft-com:vml" xmlns:wp14="http://schemas.microsoft.com/office/word/2010/wordprocessingDrawing" xmlns:wp="http://schemas.openxmlformats.org/drawingml/2006/wordprocessingDrawing" xmlns:w10="urn:schemas-microsoft-com:office:word" xmlns:w="http://schemas.openxmlformats.org/wordprocessingml/2006/main" xmlns:w14="http://schemas.microsoft.com/office/word/2010/wordml" xmlns:w15="http://schemas.microsoft.com/office/word/2012/wordml" xmlns:w16cex="http://schemas.microsoft.com/office/word/2018/wordml/cex" xmlns:w16cid="http://schemas.microsoft.com/office/word/2016/wordml/cid" xmlns:w16="http://schemas.microsoft.com/office/word/2018/wordml" xmlns:w16du="http://schemas.microsoft.com/office/word/2023/wordml/word16du" xmlns:w16sdtdh="http://schemas.microsoft.com/office/word/2020/wordml/sdtdatahash" xmlns:w16sdtfl="http://schemas.microsoft.com/office/word/2024/wordml/sdtformatlock" xmlns:w16se="http://schemas.microsoft.com/office/word/2015/wordml/symex" xmlns:wpg="http://schemas.microsoft.com/office/word/2010/wordprocessingGroup" xmlns:wpi="http://schemas.microsoft.com/office/word/2010/wordprocessingInk" xmlns:wne="http://schemas.microsoft.com/office/word/2006/wordml" xmlns:wps="http://schemas.microsoft.com/office/word/2010/wordprocessingShape" mc:Ignorable="w14 w15 w16se w16cid w16 w16cex w16sdtdh w16sdtfl w16du wp14">
   <w:body>
-    <w:bookmarkStart w:id="0" w:name="_GoBack"/>
     <w:p>
       <w:r>
         <w:rPr>
@@ -205,7 +204,7 @@
               </wp:anchor>
             </w:drawing>
           </mc:Choice>
-          <mc:Fallback xmlns:w16sdtfl="http://schemas.microsoft.com/office/word/2024/wordml/sdtformatlock" xmlns:w16sdtdh="http://schemas.microsoft.com/office/word/2020/wordml/sdtdatahash" xmlns:w16du="http://schemas.microsoft.com/office/word/2023/wordml/word16du" xmlns:w16="http://schemas.microsoft.com/office/word/2018/wordml" xmlns:w16cid="http://schemas.microsoft.com/office/word/2016/wordml/cid" xmlns:w16cex="http://schemas.microsoft.com/office/word/2018/wordml/cex" xmlns:oel="http://schemas.microsoft.com/office/2019/extlst" xmlns:am3d="http://schemas.microsoft.com/office/drawing/2017/model3d" xmlns:aink="http://schemas.microsoft.com/office/drawing/2016/ink" xmlns:cx8="http://schemas.microsoft.com/office/drawing/2016/5/14/chartex" xmlns:cx7="http://schemas.microsoft.com/office/drawing/2016/5/13/chartex" xmlns:cx6="http://schemas.microsoft.com/office/drawing/2016/5/12/chartex" xmlns:cx5="http://schemas.microsoft.com/office/drawing/2016/5/11/chartex" xmlns:cx4="http://schemas.microsoft.com/office/drawing/2016/5/10/chartex" xmlns:cx3="http://schemas.microsoft.com/office/drawing/2016/5/9/chartex" xmlns:cx2="http://schemas.microsoft.com/office/drawing/2015/10/21/chartex" xmlns:cx1="http://schemas.microsoft.com/office/drawing/2015/9/8/chartex">
+          <mc:Fallback>
             <w:pict>
               <v:rect w14:anchorId="5C23640E" id="Retângulo 2" o:spid="_x0000_s1026" style="position:absolute;margin-left:422.55pt;margin-top:45.35pt;width:70.95pt;height:64.95pt;z-index:251659264;visibility:visible;mso-wrap-style:square;mso-width-percent:0;mso-height-percent:0;mso-wrap-distance-left:9pt;mso-wrap-distance-top:0;mso-wrap-distance-right:9pt;mso-wrap-distance-bottom:0;mso-position-horizontal:absolute;mso-position-horizontal-relative:text;mso-position-vertical:absolute;mso-position-vertical-relative:page;mso-width-percent:0;mso-height-percent:0;mso-width-relative:margin;mso-height-relative:margin;v-text-anchor:middle" o:gfxdata="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" fillcolor="white [3212]" strokecolor="black [3213]" strokeweight="1pt">
                 <v:textbox>
@@ -343,13 +342,12 @@
       <w:r>
         <w:rPr>
           <w:noProof/>
-          <w:lang w:eastAsia="pt-BR"/>
         </w:rPr>
         <w:drawing>
-          <wp:inline distT="0" distB="0" distL="0" distR="0" wp14:anchorId="7FFC1011" wp14:editId="3651466E">
-            <wp:extent cx="5622196" cy="3695700"/>
-            <wp:effectExtent l="0" t="0" r="0" b="0"/>
-            <wp:docPr id="1" name="Imagem 1"/>
+          <wp:inline distT="0" distB="0" distL="0" distR="0" wp14:anchorId="7F825863" wp14:editId="1FD4BA02">
+            <wp:extent cx="6012872" cy="4476257"/>
+            <wp:effectExtent l="0" t="0" r="6985" b="635"/>
+            <wp:docPr id="1583996886" name="Imagem 2"/>
             <wp:cNvGraphicFramePr>
               <a:graphicFrameLocks xmlns:a="http://schemas.openxmlformats.org/drawingml/2006/main" noChangeAspect="1"/>
             </wp:cNvGraphicFramePr>
@@ -357,7 +355,7 @@
               <a:graphicData uri="http://schemas.openxmlformats.org/drawingml/2006/picture">
                 <pic:pic xmlns:pic="http://schemas.openxmlformats.org/drawingml/2006/picture">
                   <pic:nvPicPr>
-                    <pic:cNvPr id="1" name="MER TCC.png"/>
+                    <pic:cNvPr id="1583996886" name="Imagem 1583996886"/>
                     <pic:cNvPicPr/>
                   </pic:nvPicPr>
                   <pic:blipFill>
@@ -375,7 +373,7 @@
                   <pic:spPr>
                     <a:xfrm>
                       <a:off x="0" y="0"/>
-                      <a:ext cx="5633102" cy="3702869"/>
+                      <a:ext cx="6022204" cy="4483204"/>
                     </a:xfrm>
                     <a:prstGeom prst="rect">
                       <a:avLst/>
@@ -387,7 +385,6 @@
           </wp:inline>
         </w:drawing>
       </w:r>
-      <w:bookmarkEnd w:id="0"/>
     </w:p>
     <w:sectPr>
       <w:pgSz w:w="11909" w:h="16834"/>
@@ -400,7 +397,7 @@
 </file>
 
 <file path=word/styles.xml><?xml version="1.0" encoding="utf-8"?>
-<w:styles xmlns:mc="http://schemas.openxmlformats.org/markup-compatibility/2006" xmlns:r="http://schemas.openxmlformats.org/officeDocument/2006/relationships" xmlns:w="http://schemas.openxmlformats.org/wordprocessingml/2006/main" xmlns:w14="http://schemas.microsoft.com/office/word/2010/wordml" xmlns:w15="http://schemas.microsoft.com/office/word/2012/wordml" xmlns:w16se="http://schemas.microsoft.com/office/word/2015/wordml/symex" mc:Ignorable="w14 w15 w16se">
+<w:styles xmlns:mc="http://schemas.openxmlformats.org/markup-compatibility/2006" xmlns:r="http://schemas.openxmlformats.org/officeDocument/2006/relationships" xmlns:w="http://schemas.openxmlformats.org/wordprocessingml/2006/main" xmlns:w14="http://schemas.microsoft.com/office/word/2010/wordml" xmlns:w15="http://schemas.microsoft.com/office/word/2012/wordml" xmlns:w16cex="http://schemas.microsoft.com/office/word/2018/wordml/cex" xmlns:w16cid="http://schemas.microsoft.com/office/word/2016/wordml/cid" xmlns:w16="http://schemas.microsoft.com/office/word/2018/wordml" xmlns:w16du="http://schemas.microsoft.com/office/word/2023/wordml/word16du" xmlns:w16sdtdh="http://schemas.microsoft.com/office/word/2020/wordml/sdtdatahash" xmlns:w16sdtfl="http://schemas.microsoft.com/office/word/2024/wordml/sdtformatlock" xmlns:w16se="http://schemas.microsoft.com/office/word/2015/wordml/symex" mc:Ignorable="w14 w15 w16se w16cid w16 w16cex w16sdtdh w16sdtfl w16du">
   <w:docDefaults>
     <w:rPrDefault>
       <w:rPr>
@@ -418,7 +415,7 @@
       </w:pPr>
     </w:pPrDefault>
   </w:docDefaults>
-  <w:latentStyles w:defLockedState="0" w:defUIPriority="99" w:defSemiHidden="0" w:defUnhideWhenUsed="0" w:defQFormat="0" w:count="371">
+  <w:latentStyles w:defLockedState="0" w:defUIPriority="99" w:defSemiHidden="0" w:defUnhideWhenUsed="0" w:defQFormat="0" w:count="376">
     <w:lsdException w:name="Normal" w:uiPriority="0" w:qFormat="1"/>
     <w:lsdException w:name="heading 1" w:uiPriority="9" w:qFormat="1"/>
     <w:lsdException w:name="heading 2" w:semiHidden="1" w:uiPriority="9" w:unhideWhenUsed="1" w:qFormat="1"/>
@@ -790,6 +787,11 @@
     <w:lsdException w:name="List Table 5 Dark Accent 6" w:uiPriority="50"/>
     <w:lsdException w:name="List Table 6 Colorful Accent 6" w:uiPriority="51"/>
     <w:lsdException w:name="List Table 7 Colorful Accent 6" w:uiPriority="52"/>
+    <w:lsdException w:name="Mention" w:semiHidden="1" w:unhideWhenUsed="1"/>
+    <w:lsdException w:name="Smart Hyperlink" w:semiHidden="1" w:unhideWhenUsed="1"/>
+    <w:lsdException w:name="Hashtag" w:semiHidden="1" w:unhideWhenUsed="1"/>
+    <w:lsdException w:name="Unresolved Mention" w:semiHidden="1" w:unhideWhenUsed="1"/>
+    <w:lsdException w:name="Smart Link" w:semiHidden="1" w:unhideWhenUsed="1"/>
   </w:latentStyles>
   <w:style w:type="paragraph" w:default="1" w:styleId="Normal">
     <w:name w:val="Normal"/>

</xml_diff>

<commit_message>
Melhora no MER, script e classes no css
</commit_message>
<xml_diff>
--- a/Projeto/banco de dados/Modelagem Relacional/MER TCC (com legenda).docx
+++ b/Projeto/banco de dados/Modelagem Relacional/MER TCC (com legenda).docx
@@ -344,10 +344,10 @@
           <w:noProof/>
         </w:rPr>
         <w:drawing>
-          <wp:inline distT="0" distB="0" distL="0" distR="0" wp14:anchorId="7F825863" wp14:editId="1FD4BA02">
-            <wp:extent cx="6012872" cy="4476257"/>
-            <wp:effectExtent l="0" t="0" r="6985" b="635"/>
-            <wp:docPr id="1583996886" name="Imagem 2"/>
+          <wp:inline distT="0" distB="0" distL="0" distR="0" wp14:anchorId="184ACB86" wp14:editId="3A805A13">
+            <wp:extent cx="5706745" cy="4825946"/>
+            <wp:effectExtent l="0" t="0" r="8255" b="0"/>
+            <wp:docPr id="2135243939" name="Imagem 2"/>
             <wp:cNvGraphicFramePr>
               <a:graphicFrameLocks xmlns:a="http://schemas.openxmlformats.org/drawingml/2006/main" noChangeAspect="1"/>
             </wp:cNvGraphicFramePr>
@@ -355,7 +355,7 @@
               <a:graphicData uri="http://schemas.openxmlformats.org/drawingml/2006/picture">
                 <pic:pic xmlns:pic="http://schemas.openxmlformats.org/drawingml/2006/picture">
                   <pic:nvPicPr>
-                    <pic:cNvPr id="1583996886" name="Imagem 1583996886"/>
+                    <pic:cNvPr id="2135243939" name="Imagem 2135243939"/>
                     <pic:cNvPicPr/>
                   </pic:nvPicPr>
                   <pic:blipFill>
@@ -373,7 +373,7 @@
                   <pic:spPr>
                     <a:xfrm>
                       <a:off x="0" y="0"/>
-                      <a:ext cx="6022204" cy="4483204"/>
+                      <a:ext cx="5711480" cy="4829950"/>
                     </a:xfrm>
                     <a:prstGeom prst="rect">
                       <a:avLst/>

</xml_diff>

<commit_message>
Remoção dos resquícios dos planos no back-end, sql e mer
</commit_message>
<xml_diff>
--- a/Projeto/banco de dados/Modelagem Relacional/MER TCC (com legenda).docx
+++ b/Projeto/banco de dados/Modelagem Relacional/MER TCC (com legenda).docx
@@ -1,6 +1,6 @@
 
 <file path=word/document.xml><?xml version="1.0" encoding="utf-8"?>
-<w:document xmlns:wpc="http://schemas.microsoft.com/office/word/2010/wordprocessingCanvas" xmlns:cx="http://schemas.microsoft.com/office/drawing/2014/chartex" xmlns:cx1="http://schemas.microsoft.com/office/drawing/2015/9/8/chartex" xmlns:cx2="http://schemas.microsoft.com/office/drawing/2015/10/21/chartex" xmlns:cx3="http://schemas.microsoft.com/office/drawing/2016/5/9/chartex" xmlns:cx4="http://schemas.microsoft.com/office/drawing/2016/5/10/chartex" xmlns:cx5="http://schemas.microsoft.com/office/drawing/2016/5/11/chartex" xmlns:cx6="http://schemas.microsoft.com/office/drawing/2016/5/12/chartex" xmlns:cx7="http://schemas.microsoft.com/office/drawing/2016/5/13/chartex" xmlns:cx8="http://schemas.microsoft.com/office/drawing/2016/5/14/chartex" xmlns:mc="http://schemas.openxmlformats.org/markup-compatibility/2006" xmlns:aink="http://schemas.microsoft.com/office/drawing/2016/ink" xmlns:am3d="http://schemas.microsoft.com/office/drawing/2017/model3d" xmlns:o="urn:schemas-microsoft-com:office:office" xmlns:oel="http://schemas.microsoft.com/office/2019/extlst" xmlns:r="http://schemas.openxmlformats.org/officeDocument/2006/relationships" xmlns:m="http://schemas.openxmlformats.org/officeDocument/2006/math" xmlns:v="urn:schemas-microsoft-com:vml" xmlns:wp14="http://schemas.microsoft.com/office/word/2010/wordprocessingDrawing" xmlns:wp="http://schemas.openxmlformats.org/drawingml/2006/wordprocessingDrawing" xmlns:w10="urn:schemas-microsoft-com:office:word" xmlns:w="http://schemas.openxmlformats.org/wordprocessingml/2006/main" xmlns:w14="http://schemas.microsoft.com/office/word/2010/wordml" xmlns:w15="http://schemas.microsoft.com/office/word/2012/wordml" xmlns:w16cex="http://schemas.microsoft.com/office/word/2018/wordml/cex" xmlns:w16cid="http://schemas.microsoft.com/office/word/2016/wordml/cid" xmlns:w16="http://schemas.microsoft.com/office/word/2018/wordml" xmlns:w16du="http://schemas.microsoft.com/office/word/2023/wordml/word16du" xmlns:w16sdtdh="http://schemas.microsoft.com/office/word/2020/wordml/sdtdatahash" xmlns:w16sdtfl="http://schemas.microsoft.com/office/word/2024/wordml/sdtformatlock" xmlns:w16se="http://schemas.microsoft.com/office/word/2015/wordml/symex" xmlns:wpg="http://schemas.microsoft.com/office/word/2010/wordprocessingGroup" xmlns:wpi="http://schemas.microsoft.com/office/word/2010/wordprocessingInk" xmlns:wne="http://schemas.microsoft.com/office/word/2006/wordml" xmlns:wps="http://schemas.microsoft.com/office/word/2010/wordprocessingShape" mc:Ignorable="w14 w15 w16se w16cid w16 w16cex w16sdtdh w16sdtfl w16du wp14">
+<w:document xmlns:wpc="http://schemas.microsoft.com/office/word/2010/wordprocessingCanvas" xmlns:cx="http://schemas.microsoft.com/office/drawing/2014/chartex" xmlns:mc="http://schemas.openxmlformats.org/markup-compatibility/2006" xmlns:o="urn:schemas-microsoft-com:office:office" xmlns:r="http://schemas.openxmlformats.org/officeDocument/2006/relationships" xmlns:m="http://schemas.openxmlformats.org/officeDocument/2006/math" xmlns:v="urn:schemas-microsoft-com:vml" xmlns:wp14="http://schemas.microsoft.com/office/word/2010/wordprocessingDrawing" xmlns:wp="http://schemas.openxmlformats.org/drawingml/2006/wordprocessingDrawing" xmlns:w10="urn:schemas-microsoft-com:office:word" xmlns:w="http://schemas.openxmlformats.org/wordprocessingml/2006/main" xmlns:w14="http://schemas.microsoft.com/office/word/2010/wordml" xmlns:w15="http://schemas.microsoft.com/office/word/2012/wordml" xmlns:w16se="http://schemas.microsoft.com/office/word/2015/wordml/symex" xmlns:wpg="http://schemas.microsoft.com/office/word/2010/wordprocessingGroup" xmlns:wpi="http://schemas.microsoft.com/office/word/2010/wordprocessingInk" xmlns:wne="http://schemas.microsoft.com/office/word/2006/wordml" xmlns:wps="http://schemas.microsoft.com/office/word/2010/wordprocessingShape" mc:Ignorable="w14 w15 w16se wp14">
   <w:body>
     <w:p>
       <w:r>
@@ -204,7 +204,7 @@
               </wp:anchor>
             </w:drawing>
           </mc:Choice>
-          <mc:Fallback>
+          <mc:Fallback xmlns:w16sdtfl="http://schemas.microsoft.com/office/word/2024/wordml/sdtformatlock" xmlns:w16sdtdh="http://schemas.microsoft.com/office/word/2020/wordml/sdtdatahash" xmlns:w16du="http://schemas.microsoft.com/office/word/2023/wordml/word16du" xmlns:w16="http://schemas.microsoft.com/office/word/2018/wordml" xmlns:w16cid="http://schemas.microsoft.com/office/word/2016/wordml/cid" xmlns:w16cex="http://schemas.microsoft.com/office/word/2018/wordml/cex" xmlns:oel="http://schemas.microsoft.com/office/2019/extlst" xmlns:am3d="http://schemas.microsoft.com/office/drawing/2017/model3d" xmlns:aink="http://schemas.microsoft.com/office/drawing/2016/ink" xmlns:cx8="http://schemas.microsoft.com/office/drawing/2016/5/14/chartex" xmlns:cx7="http://schemas.microsoft.com/office/drawing/2016/5/13/chartex" xmlns:cx6="http://schemas.microsoft.com/office/drawing/2016/5/12/chartex" xmlns:cx5="http://schemas.microsoft.com/office/drawing/2016/5/11/chartex" xmlns:cx4="http://schemas.microsoft.com/office/drawing/2016/5/10/chartex" xmlns:cx3="http://schemas.microsoft.com/office/drawing/2016/5/9/chartex" xmlns:cx2="http://schemas.microsoft.com/office/drawing/2015/10/21/chartex" xmlns:cx1="http://schemas.microsoft.com/office/drawing/2015/9/8/chartex">
             <w:pict>
               <v:rect w14:anchorId="5C23640E" id="Retângulo 2" o:spid="_x0000_s1026" style="position:absolute;margin-left:422.55pt;margin-top:45.35pt;width:70.95pt;height:64.95pt;z-index:251659264;visibility:visible;mso-wrap-style:square;mso-width-percent:0;mso-height-percent:0;mso-wrap-distance-left:9pt;mso-wrap-distance-top:0;mso-wrap-distance-right:9pt;mso-wrap-distance-bottom:0;mso-position-horizontal:absolute;mso-position-horizontal-relative:text;mso-position-vertical:absolute;mso-position-vertical-relative:page;mso-width-percent:0;mso-height-percent:0;mso-width-relative:margin;mso-height-relative:margin;v-text-anchor:middle" o:gfxdata="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" fillcolor="white [3212]" strokecolor="black [3213]" strokeweight="1pt">
                 <v:textbox>
@@ -339,15 +339,17 @@
           </mc:Fallback>
         </mc:AlternateContent>
       </w:r>
+      <w:bookmarkStart w:id="0" w:name="_GoBack"/>
       <w:r>
         <w:rPr>
           <w:noProof/>
+          <w:lang w:eastAsia="pt-BR"/>
         </w:rPr>
         <w:drawing>
-          <wp:inline distT="0" distB="0" distL="0" distR="0" wp14:anchorId="184ACB86" wp14:editId="3A805A13">
-            <wp:extent cx="5706745" cy="4825946"/>
-            <wp:effectExtent l="0" t="0" r="8255" b="0"/>
-            <wp:docPr id="2135243939" name="Imagem 2"/>
+          <wp:inline distT="0" distB="0" distL="0" distR="0" wp14:anchorId="32FB5FFE" wp14:editId="39981E11">
+            <wp:extent cx="5754370" cy="4866220"/>
+            <wp:effectExtent l="0" t="0" r="0" b="0"/>
+            <wp:docPr id="1" name="Imagem 1"/>
             <wp:cNvGraphicFramePr>
               <a:graphicFrameLocks xmlns:a="http://schemas.openxmlformats.org/drawingml/2006/main" noChangeAspect="1"/>
             </wp:cNvGraphicFramePr>
@@ -355,7 +357,7 @@
               <a:graphicData uri="http://schemas.openxmlformats.org/drawingml/2006/picture">
                 <pic:pic xmlns:pic="http://schemas.openxmlformats.org/drawingml/2006/picture">
                   <pic:nvPicPr>
-                    <pic:cNvPr id="2135243939" name="Imagem 2135243939"/>
+                    <pic:cNvPr id="1" name="MER TCC.png"/>
                     <pic:cNvPicPr/>
                   </pic:nvPicPr>
                   <pic:blipFill>
@@ -373,7 +375,7 @@
                   <pic:spPr>
                     <a:xfrm>
                       <a:off x="0" y="0"/>
-                      <a:ext cx="5711480" cy="4829950"/>
+                      <a:ext cx="5756107" cy="4867689"/>
                     </a:xfrm>
                     <a:prstGeom prst="rect">
                       <a:avLst/>
@@ -385,6 +387,7 @@
           </wp:inline>
         </w:drawing>
       </w:r>
+      <w:bookmarkEnd w:id="0"/>
     </w:p>
     <w:sectPr>
       <w:pgSz w:w="11909" w:h="16834"/>
@@ -397,7 +400,7 @@
 </file>
 
 <file path=word/styles.xml><?xml version="1.0" encoding="utf-8"?>
-<w:styles xmlns:mc="http://schemas.openxmlformats.org/markup-compatibility/2006" xmlns:r="http://schemas.openxmlformats.org/officeDocument/2006/relationships" xmlns:w="http://schemas.openxmlformats.org/wordprocessingml/2006/main" xmlns:w14="http://schemas.microsoft.com/office/word/2010/wordml" xmlns:w15="http://schemas.microsoft.com/office/word/2012/wordml" xmlns:w16cex="http://schemas.microsoft.com/office/word/2018/wordml/cex" xmlns:w16cid="http://schemas.microsoft.com/office/word/2016/wordml/cid" xmlns:w16="http://schemas.microsoft.com/office/word/2018/wordml" xmlns:w16du="http://schemas.microsoft.com/office/word/2023/wordml/word16du" xmlns:w16sdtdh="http://schemas.microsoft.com/office/word/2020/wordml/sdtdatahash" xmlns:w16sdtfl="http://schemas.microsoft.com/office/word/2024/wordml/sdtformatlock" xmlns:w16se="http://schemas.microsoft.com/office/word/2015/wordml/symex" mc:Ignorable="w14 w15 w16se w16cid w16 w16cex w16sdtdh w16sdtfl w16du">
+<w:styles xmlns:mc="http://schemas.openxmlformats.org/markup-compatibility/2006" xmlns:r="http://schemas.openxmlformats.org/officeDocument/2006/relationships" xmlns:w="http://schemas.openxmlformats.org/wordprocessingml/2006/main" xmlns:w14="http://schemas.microsoft.com/office/word/2010/wordml" xmlns:w15="http://schemas.microsoft.com/office/word/2012/wordml" xmlns:w16se="http://schemas.microsoft.com/office/word/2015/wordml/symex" mc:Ignorable="w14 w15 w16se">
   <w:docDefaults>
     <w:rPrDefault>
       <w:rPr>
@@ -415,7 +418,7 @@
       </w:pPr>
     </w:pPrDefault>
   </w:docDefaults>
-  <w:latentStyles w:defLockedState="0" w:defUIPriority="99" w:defSemiHidden="0" w:defUnhideWhenUsed="0" w:defQFormat="0" w:count="376">
+  <w:latentStyles w:defLockedState="0" w:defUIPriority="99" w:defSemiHidden="0" w:defUnhideWhenUsed="0" w:defQFormat="0" w:count="371">
     <w:lsdException w:name="Normal" w:uiPriority="0" w:qFormat="1"/>
     <w:lsdException w:name="heading 1" w:uiPriority="9" w:qFormat="1"/>
     <w:lsdException w:name="heading 2" w:semiHidden="1" w:uiPriority="9" w:unhideWhenUsed="1" w:qFormat="1"/>
@@ -787,11 +790,6 @@
     <w:lsdException w:name="List Table 5 Dark Accent 6" w:uiPriority="50"/>
     <w:lsdException w:name="List Table 6 Colorful Accent 6" w:uiPriority="51"/>
     <w:lsdException w:name="List Table 7 Colorful Accent 6" w:uiPriority="52"/>
-    <w:lsdException w:name="Mention" w:semiHidden="1" w:unhideWhenUsed="1"/>
-    <w:lsdException w:name="Smart Hyperlink" w:semiHidden="1" w:unhideWhenUsed="1"/>
-    <w:lsdException w:name="Hashtag" w:semiHidden="1" w:unhideWhenUsed="1"/>
-    <w:lsdException w:name="Unresolved Mention" w:semiHidden="1" w:unhideWhenUsed="1"/>
-    <w:lsdException w:name="Smart Link" w:semiHidden="1" w:unhideWhenUsed="1"/>
   </w:latentStyles>
   <w:style w:type="paragraph" w:default="1" w:styleId="Normal">
     <w:name w:val="Normal"/>
@@ -1636,7 +1634,7 @@
 </file>
 
 <file path=customXml/itemProps1.xml><?xml version="1.0" encoding="utf-8"?>
-<ds:datastoreItem xmlns:ds="http://schemas.openxmlformats.org/officeDocument/2006/customXml" ds:itemID="{BA7E5B08-72B7-4D0E-8AC4-A3EA798DE21E}">
+<ds:datastoreItem xmlns:ds="http://schemas.openxmlformats.org/officeDocument/2006/customXml" ds:itemID="{B6CBF53D-2A59-4CDB-BF40-1973996CF38D}">
   <ds:schemaRefs>
     <ds:schemaRef ds:uri="http://schemas.openxmlformats.org/officeDocument/2006/bibliography"/>
   </ds:schemaRefs>

</xml_diff>

<commit_message>
Ajustes na terceira edição da documentação
</commit_message>
<xml_diff>
--- a/Projeto/banco de dados/Modelagem Relacional/MER TCC (com legenda).docx
+++ b/Projeto/banco de dados/Modelagem Relacional/MER TCC (com legenda).docx
@@ -1,6 +1,6 @@
 
 <file path=word/document.xml><?xml version="1.0" encoding="utf-8"?>
-<w:document xmlns:wpc="http://schemas.microsoft.com/office/word/2010/wordprocessingCanvas" xmlns:cx="http://schemas.microsoft.com/office/drawing/2014/chartex" xmlns:mc="http://schemas.openxmlformats.org/markup-compatibility/2006" xmlns:o="urn:schemas-microsoft-com:office:office" xmlns:r="http://schemas.openxmlformats.org/officeDocument/2006/relationships" xmlns:m="http://schemas.openxmlformats.org/officeDocument/2006/math" xmlns:v="urn:schemas-microsoft-com:vml" xmlns:wp14="http://schemas.microsoft.com/office/word/2010/wordprocessingDrawing" xmlns:wp="http://schemas.openxmlformats.org/drawingml/2006/wordprocessingDrawing" xmlns:w10="urn:schemas-microsoft-com:office:word" xmlns:w="http://schemas.openxmlformats.org/wordprocessingml/2006/main" xmlns:w14="http://schemas.microsoft.com/office/word/2010/wordml" xmlns:w15="http://schemas.microsoft.com/office/word/2012/wordml" xmlns:w16se="http://schemas.microsoft.com/office/word/2015/wordml/symex" xmlns:wpg="http://schemas.microsoft.com/office/word/2010/wordprocessingGroup" xmlns:wpi="http://schemas.microsoft.com/office/word/2010/wordprocessingInk" xmlns:wne="http://schemas.microsoft.com/office/word/2006/wordml" xmlns:wps="http://schemas.microsoft.com/office/word/2010/wordprocessingShape" mc:Ignorable="w14 w15 w16se wp14">
+<w:document xmlns:wpc="http://schemas.microsoft.com/office/word/2010/wordprocessingCanvas" xmlns:cx="http://schemas.microsoft.com/office/drawing/2014/chartex" xmlns:cx1="http://schemas.microsoft.com/office/drawing/2015/9/8/chartex" xmlns:cx2="http://schemas.microsoft.com/office/drawing/2015/10/21/chartex" xmlns:cx3="http://schemas.microsoft.com/office/drawing/2016/5/9/chartex" xmlns:cx4="http://schemas.microsoft.com/office/drawing/2016/5/10/chartex" xmlns:cx5="http://schemas.microsoft.com/office/drawing/2016/5/11/chartex" xmlns:cx6="http://schemas.microsoft.com/office/drawing/2016/5/12/chartex" xmlns:cx7="http://schemas.microsoft.com/office/drawing/2016/5/13/chartex" xmlns:cx8="http://schemas.microsoft.com/office/drawing/2016/5/14/chartex" xmlns:mc="http://schemas.openxmlformats.org/markup-compatibility/2006" xmlns:aink="http://schemas.microsoft.com/office/drawing/2016/ink" xmlns:am3d="http://schemas.microsoft.com/office/drawing/2017/model3d" xmlns:o="urn:schemas-microsoft-com:office:office" xmlns:oel="http://schemas.microsoft.com/office/2019/extlst" xmlns:r="http://schemas.openxmlformats.org/officeDocument/2006/relationships" xmlns:m="http://schemas.openxmlformats.org/officeDocument/2006/math" xmlns:v="urn:schemas-microsoft-com:vml" xmlns:wp14="http://schemas.microsoft.com/office/word/2010/wordprocessingDrawing" xmlns:wp="http://schemas.openxmlformats.org/drawingml/2006/wordprocessingDrawing" xmlns:w10="urn:schemas-microsoft-com:office:word" xmlns:w="http://schemas.openxmlformats.org/wordprocessingml/2006/main" xmlns:w14="http://schemas.microsoft.com/office/word/2010/wordml" xmlns:w15="http://schemas.microsoft.com/office/word/2012/wordml" xmlns:w16cex="http://schemas.microsoft.com/office/word/2018/wordml/cex" xmlns:w16cid="http://schemas.microsoft.com/office/word/2016/wordml/cid" xmlns:w16="http://schemas.microsoft.com/office/word/2018/wordml" xmlns:w16du="http://schemas.microsoft.com/office/word/2023/wordml/word16du" xmlns:w16sdtdh="http://schemas.microsoft.com/office/word/2020/wordml/sdtdatahash" xmlns:w16sdtfl="http://schemas.microsoft.com/office/word/2024/wordml/sdtformatlock" xmlns:w16se="http://schemas.microsoft.com/office/word/2015/wordml/symex" xmlns:wpg="http://schemas.microsoft.com/office/word/2010/wordprocessingGroup" xmlns:wpi="http://schemas.microsoft.com/office/word/2010/wordprocessingInk" xmlns:wne="http://schemas.microsoft.com/office/word/2006/wordml" xmlns:wps="http://schemas.microsoft.com/office/word/2010/wordprocessingShape" mc:Ignorable="w14 w15 w16se w16cid w16 w16cex w16sdtdh w16sdtfl w16du wp14">
   <w:body>
     <w:p>
       <w:r>
@@ -204,7 +204,7 @@
               </wp:anchor>
             </w:drawing>
           </mc:Choice>
-          <mc:Fallback xmlns:w16sdtfl="http://schemas.microsoft.com/office/word/2024/wordml/sdtformatlock" xmlns:w16sdtdh="http://schemas.microsoft.com/office/word/2020/wordml/sdtdatahash" xmlns:w16du="http://schemas.microsoft.com/office/word/2023/wordml/word16du" xmlns:w16="http://schemas.microsoft.com/office/word/2018/wordml" xmlns:w16cid="http://schemas.microsoft.com/office/word/2016/wordml/cid" xmlns:w16cex="http://schemas.microsoft.com/office/word/2018/wordml/cex" xmlns:oel="http://schemas.microsoft.com/office/2019/extlst" xmlns:am3d="http://schemas.microsoft.com/office/drawing/2017/model3d" xmlns:aink="http://schemas.microsoft.com/office/drawing/2016/ink" xmlns:cx8="http://schemas.microsoft.com/office/drawing/2016/5/14/chartex" xmlns:cx7="http://schemas.microsoft.com/office/drawing/2016/5/13/chartex" xmlns:cx6="http://schemas.microsoft.com/office/drawing/2016/5/12/chartex" xmlns:cx5="http://schemas.microsoft.com/office/drawing/2016/5/11/chartex" xmlns:cx4="http://schemas.microsoft.com/office/drawing/2016/5/10/chartex" xmlns:cx3="http://schemas.microsoft.com/office/drawing/2016/5/9/chartex" xmlns:cx2="http://schemas.microsoft.com/office/drawing/2015/10/21/chartex" xmlns:cx1="http://schemas.microsoft.com/office/drawing/2015/9/8/chartex">
+          <mc:Fallback>
             <w:pict>
               <v:rect w14:anchorId="5C23640E" id="Retângulo 2" o:spid="_x0000_s1026" style="position:absolute;margin-left:422.55pt;margin-top:45.35pt;width:70.95pt;height:64.95pt;z-index:251659264;visibility:visible;mso-wrap-style:square;mso-width-percent:0;mso-height-percent:0;mso-wrap-distance-left:9pt;mso-wrap-distance-top:0;mso-wrap-distance-right:9pt;mso-wrap-distance-bottom:0;mso-position-horizontal:absolute;mso-position-horizontal-relative:text;mso-position-vertical:absolute;mso-position-vertical-relative:page;mso-width-percent:0;mso-height-percent:0;mso-width-relative:margin;mso-height-relative:margin;v-text-anchor:middle" o:gfxdata="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" fillcolor="white [3212]" strokecolor="black [3213]" strokeweight="1pt">
                 <v:textbox>
@@ -339,17 +339,15 @@
           </mc:Fallback>
         </mc:AlternateContent>
       </w:r>
-      <w:bookmarkStart w:id="0" w:name="_GoBack"/>
       <w:r>
         <w:rPr>
           <w:noProof/>
-          <w:lang w:eastAsia="pt-BR"/>
         </w:rPr>
         <w:drawing>
-          <wp:inline distT="0" distB="0" distL="0" distR="0" wp14:anchorId="32FB5FFE" wp14:editId="39981E11">
-            <wp:extent cx="5754370" cy="4866220"/>
-            <wp:effectExtent l="0" t="0" r="0" b="0"/>
-            <wp:docPr id="1" name="Imagem 1"/>
+          <wp:inline distT="0" distB="0" distL="0" distR="0" wp14:anchorId="1647C453" wp14:editId="7005B057">
+            <wp:extent cx="5401945" cy="4568190"/>
+            <wp:effectExtent l="0" t="0" r="8255" b="3810"/>
+            <wp:docPr id="618127247" name="Imagem 2"/>
             <wp:cNvGraphicFramePr>
               <a:graphicFrameLocks xmlns:a="http://schemas.openxmlformats.org/drawingml/2006/main" noChangeAspect="1"/>
             </wp:cNvGraphicFramePr>
@@ -357,7 +355,7 @@
               <a:graphicData uri="http://schemas.openxmlformats.org/drawingml/2006/picture">
                 <pic:pic xmlns:pic="http://schemas.openxmlformats.org/drawingml/2006/picture">
                   <pic:nvPicPr>
-                    <pic:cNvPr id="1" name="MER TCC.png"/>
+                    <pic:cNvPr id="618127247" name="Imagem 618127247"/>
                     <pic:cNvPicPr/>
                   </pic:nvPicPr>
                   <pic:blipFill>
@@ -375,7 +373,7 @@
                   <pic:spPr>
                     <a:xfrm>
                       <a:off x="0" y="0"/>
-                      <a:ext cx="5756107" cy="4867689"/>
+                      <a:ext cx="5401945" cy="4568190"/>
                     </a:xfrm>
                     <a:prstGeom prst="rect">
                       <a:avLst/>
@@ -387,7 +385,6 @@
           </wp:inline>
         </w:drawing>
       </w:r>
-      <w:bookmarkEnd w:id="0"/>
     </w:p>
     <w:sectPr>
       <w:pgSz w:w="11909" w:h="16834"/>
@@ -400,7 +397,7 @@
 </file>
 
 <file path=word/styles.xml><?xml version="1.0" encoding="utf-8"?>
-<w:styles xmlns:mc="http://schemas.openxmlformats.org/markup-compatibility/2006" xmlns:r="http://schemas.openxmlformats.org/officeDocument/2006/relationships" xmlns:w="http://schemas.openxmlformats.org/wordprocessingml/2006/main" xmlns:w14="http://schemas.microsoft.com/office/word/2010/wordml" xmlns:w15="http://schemas.microsoft.com/office/word/2012/wordml" xmlns:w16se="http://schemas.microsoft.com/office/word/2015/wordml/symex" mc:Ignorable="w14 w15 w16se">
+<w:styles xmlns:mc="http://schemas.openxmlformats.org/markup-compatibility/2006" xmlns:r="http://schemas.openxmlformats.org/officeDocument/2006/relationships" xmlns:w="http://schemas.openxmlformats.org/wordprocessingml/2006/main" xmlns:w14="http://schemas.microsoft.com/office/word/2010/wordml" xmlns:w15="http://schemas.microsoft.com/office/word/2012/wordml" xmlns:w16cex="http://schemas.microsoft.com/office/word/2018/wordml/cex" xmlns:w16cid="http://schemas.microsoft.com/office/word/2016/wordml/cid" xmlns:w16="http://schemas.microsoft.com/office/word/2018/wordml" xmlns:w16du="http://schemas.microsoft.com/office/word/2023/wordml/word16du" xmlns:w16sdtdh="http://schemas.microsoft.com/office/word/2020/wordml/sdtdatahash" xmlns:w16sdtfl="http://schemas.microsoft.com/office/word/2024/wordml/sdtformatlock" xmlns:w16se="http://schemas.microsoft.com/office/word/2015/wordml/symex" mc:Ignorable="w14 w15 w16se w16cid w16 w16cex w16sdtdh w16sdtfl w16du">
   <w:docDefaults>
     <w:rPrDefault>
       <w:rPr>
@@ -418,7 +415,7 @@
       </w:pPr>
     </w:pPrDefault>
   </w:docDefaults>
-  <w:latentStyles w:defLockedState="0" w:defUIPriority="99" w:defSemiHidden="0" w:defUnhideWhenUsed="0" w:defQFormat="0" w:count="371">
+  <w:latentStyles w:defLockedState="0" w:defUIPriority="99" w:defSemiHidden="0" w:defUnhideWhenUsed="0" w:defQFormat="0" w:count="376">
     <w:lsdException w:name="Normal" w:uiPriority="0" w:qFormat="1"/>
     <w:lsdException w:name="heading 1" w:uiPriority="9" w:qFormat="1"/>
     <w:lsdException w:name="heading 2" w:semiHidden="1" w:uiPriority="9" w:unhideWhenUsed="1" w:qFormat="1"/>
@@ -790,6 +787,11 @@
     <w:lsdException w:name="List Table 5 Dark Accent 6" w:uiPriority="50"/>
     <w:lsdException w:name="List Table 6 Colorful Accent 6" w:uiPriority="51"/>
     <w:lsdException w:name="List Table 7 Colorful Accent 6" w:uiPriority="52"/>
+    <w:lsdException w:name="Mention" w:semiHidden="1" w:unhideWhenUsed="1"/>
+    <w:lsdException w:name="Smart Hyperlink" w:semiHidden="1" w:unhideWhenUsed="1"/>
+    <w:lsdException w:name="Hashtag" w:semiHidden="1" w:unhideWhenUsed="1"/>
+    <w:lsdException w:name="Unresolved Mention" w:semiHidden="1" w:unhideWhenUsed="1"/>
+    <w:lsdException w:name="Smart Link" w:semiHidden="1" w:unhideWhenUsed="1"/>
   </w:latentStyles>
   <w:style w:type="paragraph" w:default="1" w:styleId="Normal">
     <w:name w:val="Normal"/>

</xml_diff>